<commit_message>
Corrige la section Accès garage, ajoute photo/adresse et harmonise les titres
- Corrige le bug où la section "Accès garage" restait affichée même décochée
  (case à cocher chkShowGarage utilisée par erreur au lieu de chkShowAccesGarage)
- Ajoute la possibilité d'insérer une photo dans la section Ascenseur, placée
  à droite du texte comme les autres sections
- Souligne les titres "Local conteneurs / vide-ordures" et "Ordures Ménagères"
  pour matcher le style des autres titres de section
- Remplace le champ factice "Sélectionnez la copropriété" par une saisie
  d'adresse client, intégrée après "situées au" sur la première page

Co-Authored-By: Claude Sonnet 5 <noreply@anthropic.com>
</commit_message>
<xml_diff>
--- a/DevisGenerator/Templates/copro_devis_type_V2.docx
+++ b/DevisGenerator/Templates/copro_devis_type_V2.docx
@@ -496,6 +496,38 @@
         </w:rPr>
         <w:t xml:space="preserve"> au </w:t>
       </w:r>
+    </w:p>
+    <w:p>
+      <w:pPr>
+        <w:tabs>
+          <w:tab w:val="left" w:pos="5760"/>
+        </w:tabs>
+        <w:spacing w:after="0"/>
+        <w:jc w:val="center"/>
+        <w:rPr>
+          <w:rFonts w:ascii="Arial" w:hAnsi="Arial" w:eastAsia="Times New Roman" w:cs="Arial"/>
+          <w:smallCaps/>
+          <w:sz w:val="28"/>
+          <w:szCs w:val="28"/>
+        </w:rPr>
+      </w:pPr>
+      <w:sdt>
+        <w:sdtPr>
+          <w:id w:val="300202"/>
+          <w:tag w:val="clientAdresse"/>
+        </w:sdtPr>
+        <w:sdtContent>
+          <w:r>
+            <w:rPr>
+              <w:rFonts w:ascii="Arial" w:hAnsi="Arial" w:cs="Arial"/>
+              <w:noProof/>
+              <w:sz w:val="28"/>
+              <w:szCs w:val="28"/>
+            </w:rPr>
+            <w:t xml:space="preserve">clientAdresse</w:t>
+          </w:r>
+        </w:sdtContent>
+      </w:sdt>
     </w:p>
     <w:p>
       <w:pPr>
@@ -2485,71 +2517,149 @@
         </w:rPr>
       </w:pPr>
     </w:p>
-    <w:p>
-      <w:pPr>
-        <w:spacing w:after="0" w:line="240" w:lineRule="auto"/>
-        <w:rPr>
-          <w:rFonts w:ascii="Arial" w:hAnsi="Arial" w:eastAsia="Times New Roman" w:cs="Arial"/>
-          <w:b/>
-          <w:u w:val="single"/>
-        </w:rPr>
-      </w:pPr>
-      <w:proofErr w:type="spellStart"/>
-      <w:sdt>
-        <w:sdtPr>
-          <w:id w:val="300018"/>
-          <w:tag w:val="ShowTitreAscenceur"/>
-        </w:sdtPr>
-        <w:sdtContent>
-          <w:r>
-            <w:rPr>
-              <w:rFonts w:ascii="Arial" w:hAnsi="Arial" w:eastAsia="Times New Roman" w:cs="Arial"/>
-              <w:b/>
-              <w:u w:val="single"/>
-            </w:rPr>
-            <w:t xml:space="preserve">ShowTitreAscenceur</w:t>
-          </w:r>
-        </w:sdtContent>
-      </w:sdt>
-      <w:proofErr w:type="spellEnd"/>
-    </w:p>
-    <w:p>
-      <w:pPr>
-        <w:spacing w:line="240" w:lineRule="auto"/>
-        <w:contextualSpacing/>
-        <w:rPr>
-          <w:rFonts w:ascii="Arial" w:hAnsi="Arial" w:cs="Arial"/>
-        </w:rPr>
-      </w:pPr>
-      <w:proofErr w:type="spellStart"/>
-      <w:sdt>
-        <w:sdtPr>
-          <w:id w:val="300019"/>
-          <w:tag w:val="ShowAscenceur"/>
-        </w:sdtPr>
-        <w:sdtContent>
-          <w:r>
-            <w:rPr>
-              <w:rFonts w:ascii="Arial" w:hAnsi="Arial" w:cs="Arial"/>
-            </w:rPr>
-            <w:t xml:space="preserve">ShowAscenceur</w:t>
-          </w:r>
-        </w:sdtContent>
-      </w:sdt>
-      <w:proofErr w:type="spellEnd"/>
-    </w:p>
-    <w:p>
-      <w:pPr>
-        <w:spacing w:line="240" w:lineRule="auto"/>
-        <w:contextualSpacing/>
-        <w:rPr>
-          <w:rFonts w:ascii="Arial" w:hAnsi="Arial" w:eastAsia="Times New Roman" w:cs="Arial"/>
-          <w:b/>
-          <w:highlight w:val="yellow"/>
-          <w:lang w:eastAsia="fr-FR"/>
-        </w:rPr>
-      </w:pPr>
-    </w:p>
+    <w:tbl>
+      <w:tblPr>
+        <w:tblStyle w:val="Grilledutableau"/>
+        <w:tblW w:w="0" w:type="auto"/>
+        <w:tblBorders>
+          <w:top w:val="none" w:color="auto" w:sz="0" w:space="0"/>
+          <w:left w:val="none" w:color="auto" w:sz="0" w:space="0"/>
+          <w:bottom w:val="none" w:color="auto" w:sz="0" w:space="0"/>
+          <w:right w:val="none" w:color="auto" w:sz="0" w:space="0"/>
+          <w:insideH w:val="none" w:color="auto" w:sz="0" w:space="0"/>
+          <w:insideV w:val="none" w:color="auto" w:sz="0" w:space="0"/>
+        </w:tblBorders>
+        <w:tblLook w:val="04A0" w:firstRow="1" w:lastRow="0" w:firstColumn="1" w:lastColumn="0" w:noHBand="0" w:noVBand="1"/>
+      </w:tblPr>
+      <w:tblGrid>
+        <w:gridCol w:w="7650"/>
+        <w:gridCol w:w="1410"/>
+      </w:tblGrid>
+      <w:tr>
+        <w:tc>
+          <w:tcPr>
+            <w:tcW w:w="7650" w:type="dxa"/>
+          </w:tcPr>
+          <w:p>
+            <w:pPr>
+              <w:spacing w:after="0" w:line="240" w:lineRule="auto"/>
+              <w:rPr>
+                <w:rFonts w:ascii="Arial" w:hAnsi="Arial" w:eastAsia="Times New Roman" w:cs="Arial"/>
+                <w:b/>
+                <w:u w:val="single"/>
+              </w:rPr>
+            </w:pPr>
+            <w:proofErr w:type="spellStart"/>
+            <w:sdt>
+              <w:sdtPr>
+                <w:id w:val="300018"/>
+                <w:tag w:val="ShowTitreAscenceur"/>
+              </w:sdtPr>
+              <w:sdtContent>
+                <w:r>
+                  <w:rPr>
+                    <w:rFonts w:ascii="Arial" w:hAnsi="Arial" w:eastAsia="Times New Roman" w:cs="Arial"/>
+                    <w:b/>
+                    <w:u w:val="single"/>
+                  </w:rPr>
+                  <w:t xml:space="preserve">ShowTitreAscenceur</w:t>
+                </w:r>
+              </w:sdtContent>
+            </w:sdt>
+            <w:proofErr w:type="spellEnd"/>
+          </w:p>
+          <w:p>
+            <w:pPr>
+              <w:spacing w:line="240" w:lineRule="auto"/>
+              <w:contextualSpacing/>
+              <w:rPr>
+                <w:rFonts w:ascii="Arial" w:hAnsi="Arial" w:cs="Arial"/>
+              </w:rPr>
+            </w:pPr>
+            <w:proofErr w:type="spellStart"/>
+            <w:sdt>
+              <w:sdtPr>
+                <w:id w:val="300019"/>
+                <w:tag w:val="ShowAscenceur"/>
+              </w:sdtPr>
+              <w:sdtContent>
+                <w:r>
+                  <w:rPr>
+                    <w:rFonts w:ascii="Arial" w:hAnsi="Arial" w:cs="Arial"/>
+                  </w:rPr>
+                  <w:t xml:space="preserve">ShowAscenceur</w:t>
+                </w:r>
+              </w:sdtContent>
+            </w:sdt>
+            <w:proofErr w:type="spellEnd"/>
+          </w:p>
+          <w:p>
+            <w:pPr>
+              <w:spacing w:line="240" w:lineRule="auto"/>
+              <w:contextualSpacing/>
+              <w:rPr>
+                <w:rFonts w:ascii="Arial" w:hAnsi="Arial" w:eastAsia="Times New Roman" w:cs="Arial"/>
+                <w:b/>
+                <w:highlight w:val="yellow"/>
+                <w:lang w:eastAsia="fr-FR"/>
+              </w:rPr>
+            </w:pPr>
+          </w:p>
+        </w:tc>
+        <w:tc>
+          <w:tcPr>
+            <w:tcW w:w="1410" w:type="dxa"/>
+          </w:tcPr>
+          <w:sdt>
+            <w:sdtPr>
+              <w:id w:val="300201"/>
+              <w:tag w:val="PhotoAscenceur"/>
+            </w:sdtPr>
+            <w:sdtContent>
+              <w:p>
+                <w:r>
+                  <w:drawing>
+                    <wp:inline distT="0" distB="0" distL="0" distR="0">
+                      <wp:extent cx="1333500" cy="2095500"/>
+                      <wp:effectExtent l="0" t="0" r="0" b="0"/>
+                      <wp:docPr id="500201" name="placeholder.png"/>
+                      <wp:cNvGraphicFramePr>
+                        <a:graphicFrameLocks noChangeAspect="1"/>
+                      </wp:cNvGraphicFramePr>
+                      <a:graphic>
+                        <a:graphicData uri="http://schemas.openxmlformats.org/drawingml/2006/picture">
+                          <pic:pic>
+                            <pic:nvPicPr>
+                              <pic:cNvPr id="500009" name="placeholder.png"/>
+                              <pic:cNvPicPr/>
+                            </pic:nvPicPr>
+                            <pic:blipFill>
+                              <a:blip r:embed="Re4216a15e9d84fa6"/>
+                              <a:stretch>
+                                <a:fillRect/>
+                              </a:stretch>
+                            </pic:blipFill>
+                            <pic:spPr>
+                              <a:xfrm>
+                                <a:off x="0" y="0"/>
+                                <a:ext cx="1333500" cy="2095500"/>
+                              </a:xfrm>
+                              <a:prstGeom prst="rect">
+                                <a:avLst/>
+                              </a:prstGeom>
+                            </pic:spPr>
+                          </pic:pic>
+                        </a:graphicData>
+                      </a:graphic>
+                    </wp:inline>
+                  </w:drawing>
+                </w:r>
+              </w:p>
+            </w:sdtContent>
+          </w:sdt>
+        </w:tc>
+      </w:tr>
+    </w:tbl>
     <w:p>
       <w:pPr>
         <w:spacing w:line="240" w:lineRule="auto"/>
@@ -4101,6 +4211,7 @@
                   <w:rPr>
                     <w:rFonts w:ascii="Arial" w:hAnsi="Arial" w:eastAsia="Times New Roman" w:cs="Arial"/>
                     <w:b/>
+                    <w:u w:val="single"/>
                     <w:lang w:eastAsia="fr-FR"/>
                   </w:rPr>
                   <w:t xml:space="preserve">ShowTitreLocalConteneurs</w:t>
@@ -4282,6 +4393,7 @@
         <w:rPr>
           <w:rFonts w:ascii="Arial" w:hAnsi="Arial" w:eastAsia="Times New Roman" w:cs="Arial"/>
           <w:b/>
+          <w:u w:val="single"/>
           <w:lang w:eastAsia="fr-FR"/>
         </w:rPr>
         <w:t>Ordures Ménagères</w:t>

</xml_diff>

<commit_message>
Rend la section Ordures Ménagères conditionnelle à sa case à cocher
Co-Authored-By: Claude Sonnet 5 <noreply@anthropic.com>
</commit_message>
<xml_diff>
--- a/DevisGenerator/Templates/copro_devis_type_V2.docx
+++ b/DevisGenerator/Templates/copro_devis_type_V2.docx
@@ -4389,15 +4389,23 @@
           <w:lang w:eastAsia="fr-FR"/>
         </w:rPr>
       </w:pPr>
-      <w:r>
-        <w:rPr>
-          <w:rFonts w:ascii="Arial" w:hAnsi="Arial" w:eastAsia="Times New Roman" w:cs="Arial"/>
-          <w:b/>
-          <w:u w:val="single"/>
-          <w:lang w:eastAsia="fr-FR"/>
-        </w:rPr>
-        <w:t>Ordures Ménagères</w:t>
-      </w:r>
+      <w:sdt>
+        <w:sdtPr>
+          <w:id w:val="300203"/>
+          <w:tag w:val="ShowTitreOrdures"/>
+        </w:sdtPr>
+        <w:sdtContent>
+          <w:r>
+            <w:rPr>
+              <w:rFonts w:ascii="Arial" w:hAnsi="Arial" w:eastAsia="Times New Roman" w:cs="Arial"/>
+              <w:b/>
+              <w:u w:val="single"/>
+              <w:lang w:eastAsia="fr-FR"/>
+            </w:rPr>
+            <w:t>Ordures Ménagères</w:t>
+          </w:r>
+        </w:sdtContent>
+      </w:sdt>
       <w:r>
         <w:rPr>
           <w:rFonts w:ascii="Arial" w:hAnsi="Arial" w:eastAsia="Times New Roman" w:cs="Arial"/>

</xml_diff>